<commit_message>
feat: finalize hackathon prototype and demo
</commit_message>
<xml_diff>
--- a/docs/APPROACH_NOTE.docx
+++ b/docs/APPROACH_NOTE.docx
@@ -46,7 +46,7 @@
         <w:rPr>
           <w:i/>
         </w:rPr>
-        <w:t>Generated from local pipeline outputs at 2026-10-07T09:53:59.216261+00:00. All quantities below are drawn from the four supplied files; encoded target classes are retained without an undocumented 0/1 interpretation.</w:t>
+        <w:t>Generated from local pipeline outputs at 2026-10-07T10:16:49.230123+00:00. All quantities below are drawn from the four supplied files; encoded target classes are retained without an undocumented 0/1 interpretation.</w:t>
       </w:r>
     </w:p>
     <w:p>
@@ -121,6 +121,7 @@
       </w:tblGrid>
       <w:tr>
         <w:trPr>
+          <w:tblHeader w:val="true"/>
           <w:cantSplit/>
         </w:trPr>
         <w:tc>
@@ -713,6 +714,7 @@
       </w:tblGrid>
       <w:tr>
         <w:trPr>
+          <w:tblHeader w:val="true"/>
           <w:cantSplit/>
         </w:trPr>
         <w:tc>
@@ -1558,6 +1560,872 @@
       </w:r>
     </w:p>
     <w:p>
+      <w:pPr>
+        <w:keepNext/>
+      </w:pPr>
+      <w:r>
+        <w:t>Normalized top-20 skill vocabulary:</w:t>
+      </w:r>
+    </w:p>
+    <w:tbl>
+      <w:tblPr>
+        <w:tblStyle w:val="TableGrid"/>
+        <w:tblW w:type="auto" w:w="0"/>
+        <w:tblLook w:firstColumn="1" w:firstRow="1" w:lastColumn="0" w:lastRow="0" w:noHBand="0" w:noVBand="1" w:val="04A0"/>
+      </w:tblPr>
+      <w:tblGrid>
+        <w:gridCol w:w="4896"/>
+        <w:gridCol w:w="4896"/>
+      </w:tblGrid>
+      <w:tr>
+        <w:trPr>
+          <w:tblHeader w:val="true"/>
+          <w:cantSplit/>
+        </w:trPr>
+        <w:tc>
+          <w:tcPr>
+            <w:tcW w:type="dxa" w:w="4896"/>
+          </w:tcPr>
+          <w:p>
+            <w:pPr>
+              <w:spacing w:line="240" w:lineRule="auto"/>
+            </w:pPr>
+            <w:r>
+              <w:rPr>
+                <w:rFonts w:ascii="Times New Roman" w:hAnsi="Times New Roman" w:eastAsia="Times New Roman"/>
+                <w:b/>
+                <w:sz w:val="24"/>
+              </w:rPr>
+              <w:t>Term</w:t>
+            </w:r>
+          </w:p>
+        </w:tc>
+        <w:tc>
+          <w:tcPr>
+            <w:tcW w:type="dxa" w:w="4896"/>
+          </w:tcPr>
+          <w:p>
+            <w:pPr>
+              <w:spacing w:line="240" w:lineRule="auto"/>
+            </w:pPr>
+            <w:r>
+              <w:rPr>
+                <w:rFonts w:ascii="Times New Roman" w:hAnsi="Times New Roman" w:eastAsia="Times New Roman"/>
+                <w:b/>
+                <w:sz w:val="24"/>
+              </w:rPr>
+              <w:t>Mention frequency</w:t>
+            </w:r>
+          </w:p>
+        </w:tc>
+      </w:tr>
+      <w:tr>
+        <w:trPr>
+          <w:cantSplit/>
+        </w:trPr>
+        <w:tc>
+          <w:tcPr>
+            <w:tcW w:type="dxa" w:w="4896"/>
+          </w:tcPr>
+          <w:p>
+            <w:pPr>
+              <w:spacing w:line="240" w:lineRule="auto"/>
+            </w:pPr>
+            <w:r>
+              <w:rPr>
+                <w:rFonts w:ascii="Times New Roman" w:hAnsi="Times New Roman" w:eastAsia="Times New Roman"/>
+                <w:sz w:val="24"/>
+              </w:rPr>
+              <w:t>analytics</w:t>
+            </w:r>
+          </w:p>
+        </w:tc>
+        <w:tc>
+          <w:tcPr>
+            <w:tcW w:type="dxa" w:w="4896"/>
+          </w:tcPr>
+          <w:p>
+            <w:pPr>
+              <w:spacing w:line="240" w:lineRule="auto"/>
+            </w:pPr>
+            <w:r>
+              <w:rPr>
+                <w:rFonts w:ascii="Times New Roman" w:hAnsi="Times New Roman" w:eastAsia="Times New Roman"/>
+                <w:sz w:val="24"/>
+              </w:rPr>
+              <w:t>1,048</w:t>
+            </w:r>
+          </w:p>
+        </w:tc>
+      </w:tr>
+      <w:tr>
+        <w:trPr>
+          <w:cantSplit/>
+        </w:trPr>
+        <w:tc>
+          <w:tcPr>
+            <w:tcW w:type="dxa" w:w="4896"/>
+          </w:tcPr>
+          <w:p>
+            <w:pPr>
+              <w:spacing w:line="240" w:lineRule="auto"/>
+            </w:pPr>
+            <w:r>
+              <w:rPr>
+                <w:rFonts w:ascii="Times New Roman" w:hAnsi="Times New Roman" w:eastAsia="Times New Roman"/>
+                <w:sz w:val="24"/>
+              </w:rPr>
+              <w:t>sql</w:t>
+            </w:r>
+          </w:p>
+        </w:tc>
+        <w:tc>
+          <w:tcPr>
+            <w:tcW w:type="dxa" w:w="4896"/>
+          </w:tcPr>
+          <w:p>
+            <w:pPr>
+              <w:spacing w:line="240" w:lineRule="auto"/>
+            </w:pPr>
+            <w:r>
+              <w:rPr>
+                <w:rFonts w:ascii="Times New Roman" w:hAnsi="Times New Roman" w:eastAsia="Times New Roman"/>
+                <w:sz w:val="24"/>
+              </w:rPr>
+              <w:t>1,009</w:t>
+            </w:r>
+          </w:p>
+        </w:tc>
+      </w:tr>
+      <w:tr>
+        <w:trPr>
+          <w:cantSplit/>
+        </w:trPr>
+        <w:tc>
+          <w:tcPr>
+            <w:tcW w:type="dxa" w:w="4896"/>
+          </w:tcPr>
+          <w:p>
+            <w:pPr>
+              <w:spacing w:line="240" w:lineRule="auto"/>
+            </w:pPr>
+            <w:r>
+              <w:rPr>
+                <w:rFonts w:ascii="Times New Roman" w:hAnsi="Times New Roman" w:eastAsia="Times New Roman"/>
+                <w:sz w:val="24"/>
+              </w:rPr>
+              <w:t>python</w:t>
+            </w:r>
+          </w:p>
+        </w:tc>
+        <w:tc>
+          <w:tcPr>
+            <w:tcW w:type="dxa" w:w="4896"/>
+          </w:tcPr>
+          <w:p>
+            <w:pPr>
+              <w:spacing w:line="240" w:lineRule="auto"/>
+            </w:pPr>
+            <w:r>
+              <w:rPr>
+                <w:rFonts w:ascii="Times New Roman" w:hAnsi="Times New Roman" w:eastAsia="Times New Roman"/>
+                <w:sz w:val="24"/>
+              </w:rPr>
+              <w:t>938</w:t>
+            </w:r>
+          </w:p>
+        </w:tc>
+      </w:tr>
+      <w:tr>
+        <w:trPr>
+          <w:cantSplit/>
+        </w:trPr>
+        <w:tc>
+          <w:tcPr>
+            <w:tcW w:type="dxa" w:w="4896"/>
+          </w:tcPr>
+          <w:p>
+            <w:pPr>
+              <w:spacing w:line="240" w:lineRule="auto"/>
+            </w:pPr>
+            <w:r>
+              <w:rPr>
+                <w:rFonts w:ascii="Times New Roman" w:hAnsi="Times New Roman" w:eastAsia="Times New Roman"/>
+                <w:sz w:val="24"/>
+              </w:rPr>
+              <w:t>finance</w:t>
+            </w:r>
+          </w:p>
+        </w:tc>
+        <w:tc>
+          <w:tcPr>
+            <w:tcW w:type="dxa" w:w="4896"/>
+          </w:tcPr>
+          <w:p>
+            <w:pPr>
+              <w:spacing w:line="240" w:lineRule="auto"/>
+            </w:pPr>
+            <w:r>
+              <w:rPr>
+                <w:rFonts w:ascii="Times New Roman" w:hAnsi="Times New Roman" w:eastAsia="Times New Roman"/>
+                <w:sz w:val="24"/>
+              </w:rPr>
+              <w:t>811</w:t>
+            </w:r>
+          </w:p>
+        </w:tc>
+      </w:tr>
+      <w:tr>
+        <w:trPr>
+          <w:cantSplit/>
+        </w:trPr>
+        <w:tc>
+          <w:tcPr>
+            <w:tcW w:type="dxa" w:w="4896"/>
+          </w:tcPr>
+          <w:p>
+            <w:pPr>
+              <w:spacing w:line="240" w:lineRule="auto"/>
+            </w:pPr>
+            <w:r>
+              <w:rPr>
+                <w:rFonts w:ascii="Times New Roman" w:hAnsi="Times New Roman" w:eastAsia="Times New Roman"/>
+                <w:sz w:val="24"/>
+              </w:rPr>
+              <w:t>java</w:t>
+            </w:r>
+          </w:p>
+        </w:tc>
+        <w:tc>
+          <w:tcPr>
+            <w:tcW w:type="dxa" w:w="4896"/>
+          </w:tcPr>
+          <w:p>
+            <w:pPr>
+              <w:spacing w:line="240" w:lineRule="auto"/>
+            </w:pPr>
+            <w:r>
+              <w:rPr>
+                <w:rFonts w:ascii="Times New Roman" w:hAnsi="Times New Roman" w:eastAsia="Times New Roman"/>
+                <w:sz w:val="24"/>
+              </w:rPr>
+              <w:t>752</w:t>
+            </w:r>
+          </w:p>
+        </w:tc>
+      </w:tr>
+      <w:tr>
+        <w:trPr>
+          <w:cantSplit/>
+        </w:trPr>
+        <w:tc>
+          <w:tcPr>
+            <w:tcW w:type="dxa" w:w="4896"/>
+          </w:tcPr>
+          <w:p>
+            <w:pPr>
+              <w:spacing w:line="240" w:lineRule="auto"/>
+            </w:pPr>
+            <w:r>
+              <w:rPr>
+                <w:rFonts w:ascii="Times New Roman" w:hAnsi="Times New Roman" w:eastAsia="Times New Roman"/>
+                <w:sz w:val="24"/>
+              </w:rPr>
+              <w:t>business analysis</w:t>
+            </w:r>
+          </w:p>
+        </w:tc>
+        <w:tc>
+          <w:tcPr>
+            <w:tcW w:type="dxa" w:w="4896"/>
+          </w:tcPr>
+          <w:p>
+            <w:pPr>
+              <w:spacing w:line="240" w:lineRule="auto"/>
+            </w:pPr>
+            <w:r>
+              <w:rPr>
+                <w:rFonts w:ascii="Times New Roman" w:hAnsi="Times New Roman" w:eastAsia="Times New Roman"/>
+                <w:sz w:val="24"/>
+              </w:rPr>
+              <w:t>730</w:t>
+            </w:r>
+          </w:p>
+        </w:tc>
+      </w:tr>
+      <w:tr>
+        <w:trPr>
+          <w:cantSplit/>
+        </w:trPr>
+        <w:tc>
+          <w:tcPr>
+            <w:tcW w:type="dxa" w:w="4896"/>
+          </w:tcPr>
+          <w:p>
+            <w:pPr>
+              <w:spacing w:line="240" w:lineRule="auto"/>
+            </w:pPr>
+            <w:r>
+              <w:rPr>
+                <w:rFonts w:ascii="Times New Roman" w:hAnsi="Times New Roman" w:eastAsia="Times New Roman"/>
+                <w:sz w:val="24"/>
+              </w:rPr>
+              <w:t>machine learning</w:t>
+            </w:r>
+          </w:p>
+        </w:tc>
+        <w:tc>
+          <w:tcPr>
+            <w:tcW w:type="dxa" w:w="4896"/>
+          </w:tcPr>
+          <w:p>
+            <w:pPr>
+              <w:spacing w:line="240" w:lineRule="auto"/>
+            </w:pPr>
+            <w:r>
+              <w:rPr>
+                <w:rFonts w:ascii="Times New Roman" w:hAnsi="Times New Roman" w:eastAsia="Times New Roman"/>
+                <w:sz w:val="24"/>
+              </w:rPr>
+              <w:t>724</w:t>
+            </w:r>
+          </w:p>
+        </w:tc>
+      </w:tr>
+      <w:tr>
+        <w:trPr>
+          <w:cantSplit/>
+        </w:trPr>
+        <w:tc>
+          <w:tcPr>
+            <w:tcW w:type="dxa" w:w="4896"/>
+          </w:tcPr>
+          <w:p>
+            <w:pPr>
+              <w:spacing w:line="240" w:lineRule="auto"/>
+            </w:pPr>
+            <w:r>
+              <w:rPr>
+                <w:rFonts w:ascii="Times New Roman" w:hAnsi="Times New Roman" w:eastAsia="Times New Roman"/>
+                <w:sz w:val="24"/>
+              </w:rPr>
+              <w:t>data analysis</w:t>
+            </w:r>
+          </w:p>
+        </w:tc>
+        <w:tc>
+          <w:tcPr>
+            <w:tcW w:type="dxa" w:w="4896"/>
+          </w:tcPr>
+          <w:p>
+            <w:pPr>
+              <w:spacing w:line="240" w:lineRule="auto"/>
+            </w:pPr>
+            <w:r>
+              <w:rPr>
+                <w:rFonts w:ascii="Times New Roman" w:hAnsi="Times New Roman" w:eastAsia="Times New Roman"/>
+                <w:sz w:val="24"/>
+              </w:rPr>
+              <w:t>721</w:t>
+            </w:r>
+          </w:p>
+        </w:tc>
+      </w:tr>
+      <w:tr>
+        <w:trPr>
+          <w:cantSplit/>
+        </w:trPr>
+        <w:tc>
+          <w:tcPr>
+            <w:tcW w:type="dxa" w:w="4896"/>
+          </w:tcPr>
+          <w:p>
+            <w:pPr>
+              <w:spacing w:line="240" w:lineRule="auto"/>
+            </w:pPr>
+            <w:r>
+              <w:rPr>
+                <w:rFonts w:ascii="Times New Roman" w:hAnsi="Times New Roman" w:eastAsia="Times New Roman"/>
+                <w:sz w:val="24"/>
+              </w:rPr>
+              <w:t>r</w:t>
+            </w:r>
+          </w:p>
+        </w:tc>
+        <w:tc>
+          <w:tcPr>
+            <w:tcW w:type="dxa" w:w="4896"/>
+          </w:tcPr>
+          <w:p>
+            <w:pPr>
+              <w:spacing w:line="240" w:lineRule="auto"/>
+            </w:pPr>
+            <w:r>
+              <w:rPr>
+                <w:rFonts w:ascii="Times New Roman" w:hAnsi="Times New Roman" w:eastAsia="Times New Roman"/>
+                <w:sz w:val="24"/>
+              </w:rPr>
+              <w:t>719</w:t>
+            </w:r>
+          </w:p>
+        </w:tc>
+      </w:tr>
+      <w:tr>
+        <w:trPr>
+          <w:cantSplit/>
+        </w:trPr>
+        <w:tc>
+          <w:tcPr>
+            <w:tcW w:type="dxa" w:w="4896"/>
+          </w:tcPr>
+          <w:p>
+            <w:pPr>
+              <w:spacing w:line="240" w:lineRule="auto"/>
+            </w:pPr>
+            <w:r>
+              <w:rPr>
+                <w:rFonts w:ascii="Times New Roman" w:hAnsi="Times New Roman" w:eastAsia="Times New Roman"/>
+                <w:sz w:val="24"/>
+              </w:rPr>
+              <w:t>sas</w:t>
+            </w:r>
+          </w:p>
+        </w:tc>
+        <w:tc>
+          <w:tcPr>
+            <w:tcW w:type="dxa" w:w="4896"/>
+          </w:tcPr>
+          <w:p>
+            <w:pPr>
+              <w:spacing w:line="240" w:lineRule="auto"/>
+            </w:pPr>
+            <w:r>
+              <w:rPr>
+                <w:rFonts w:ascii="Times New Roman" w:hAnsi="Times New Roman" w:eastAsia="Times New Roman"/>
+                <w:sz w:val="24"/>
+              </w:rPr>
+              <w:t>715</w:t>
+            </w:r>
+          </w:p>
+        </w:tc>
+      </w:tr>
+      <w:tr>
+        <w:trPr>
+          <w:cantSplit/>
+        </w:trPr>
+        <w:tc>
+          <w:tcPr>
+            <w:tcW w:type="dxa" w:w="4896"/>
+          </w:tcPr>
+          <w:p>
+            <w:pPr>
+              <w:spacing w:line="240" w:lineRule="auto"/>
+            </w:pPr>
+            <w:r>
+              <w:rPr>
+                <w:rFonts w:ascii="Times New Roman" w:hAnsi="Times New Roman" w:eastAsia="Times New Roman"/>
+                <w:sz w:val="24"/>
+              </w:rPr>
+              <w:t>digital marketing</w:t>
+            </w:r>
+          </w:p>
+        </w:tc>
+        <w:tc>
+          <w:tcPr>
+            <w:tcW w:type="dxa" w:w="4896"/>
+          </w:tcPr>
+          <w:p>
+            <w:pPr>
+              <w:spacing w:line="240" w:lineRule="auto"/>
+            </w:pPr>
+            <w:r>
+              <w:rPr>
+                <w:rFonts w:ascii="Times New Roman" w:hAnsi="Times New Roman" w:eastAsia="Times New Roman"/>
+                <w:sz w:val="24"/>
+              </w:rPr>
+              <w:t>612</w:t>
+            </w:r>
+          </w:p>
+        </w:tc>
+      </w:tr>
+      <w:tr>
+        <w:trPr>
+          <w:cantSplit/>
+        </w:trPr>
+        <w:tc>
+          <w:tcPr>
+            <w:tcW w:type="dxa" w:w="4896"/>
+          </w:tcPr>
+          <w:p>
+            <w:pPr>
+              <w:spacing w:line="240" w:lineRule="auto"/>
+            </w:pPr>
+            <w:r>
+              <w:rPr>
+                <w:rFonts w:ascii="Times New Roman" w:hAnsi="Times New Roman" w:eastAsia="Times New Roman"/>
+                <w:sz w:val="24"/>
+              </w:rPr>
+              <w:t>project management</w:t>
+            </w:r>
+          </w:p>
+        </w:tc>
+        <w:tc>
+          <w:tcPr>
+            <w:tcW w:type="dxa" w:w="4896"/>
+          </w:tcPr>
+          <w:p>
+            <w:pPr>
+              <w:spacing w:line="240" w:lineRule="auto"/>
+            </w:pPr>
+            <w:r>
+              <w:rPr>
+                <w:rFonts w:ascii="Times New Roman" w:hAnsi="Times New Roman" w:eastAsia="Times New Roman"/>
+                <w:sz w:val="24"/>
+              </w:rPr>
+              <w:t>575</w:t>
+            </w:r>
+          </w:p>
+        </w:tc>
+      </w:tr>
+      <w:tr>
+        <w:trPr>
+          <w:cantSplit/>
+        </w:trPr>
+        <w:tc>
+          <w:tcPr>
+            <w:tcW w:type="dxa" w:w="4896"/>
+          </w:tcPr>
+          <w:p>
+            <w:pPr>
+              <w:spacing w:line="240" w:lineRule="auto"/>
+            </w:pPr>
+            <w:r>
+              <w:rPr>
+                <w:rFonts w:ascii="Times New Roman" w:hAnsi="Times New Roman" w:eastAsia="Times New Roman"/>
+                <w:sz w:val="24"/>
+              </w:rPr>
+              <w:t>javascript</w:t>
+            </w:r>
+          </w:p>
+        </w:tc>
+        <w:tc>
+          <w:tcPr>
+            <w:tcW w:type="dxa" w:w="4896"/>
+          </w:tcPr>
+          <w:p>
+            <w:pPr>
+              <w:spacing w:line="240" w:lineRule="auto"/>
+            </w:pPr>
+            <w:r>
+              <w:rPr>
+                <w:rFonts w:ascii="Times New Roman" w:hAnsi="Times New Roman" w:eastAsia="Times New Roman"/>
+                <w:sz w:val="24"/>
+              </w:rPr>
+              <w:t>561</w:t>
+            </w:r>
+          </w:p>
+        </w:tc>
+      </w:tr>
+      <w:tr>
+        <w:trPr>
+          <w:cantSplit/>
+        </w:trPr>
+        <w:tc>
+          <w:tcPr>
+            <w:tcW w:type="dxa" w:w="4896"/>
+          </w:tcPr>
+          <w:p>
+            <w:pPr>
+              <w:spacing w:line="240" w:lineRule="auto"/>
+            </w:pPr>
+            <w:r>
+              <w:rPr>
+                <w:rFonts w:ascii="Times New Roman" w:hAnsi="Times New Roman" w:eastAsia="Times New Roman"/>
+                <w:sz w:val="24"/>
+              </w:rPr>
+              <w:t>data analytics</w:t>
+            </w:r>
+          </w:p>
+        </w:tc>
+        <w:tc>
+          <w:tcPr>
+            <w:tcW w:type="dxa" w:w="4896"/>
+          </w:tcPr>
+          <w:p>
+            <w:pPr>
+              <w:spacing w:line="240" w:lineRule="auto"/>
+            </w:pPr>
+            <w:r>
+              <w:rPr>
+                <w:rFonts w:ascii="Times New Roman" w:hAnsi="Times New Roman" w:eastAsia="Times New Roman"/>
+                <w:sz w:val="24"/>
+              </w:rPr>
+              <w:t>526</w:t>
+            </w:r>
+          </w:p>
+        </w:tc>
+      </w:tr>
+      <w:tr>
+        <w:trPr>
+          <w:cantSplit/>
+        </w:trPr>
+        <w:tc>
+          <w:tcPr>
+            <w:tcW w:type="dxa" w:w="4896"/>
+          </w:tcPr>
+          <w:p>
+            <w:pPr>
+              <w:spacing w:line="240" w:lineRule="auto"/>
+            </w:pPr>
+            <w:r>
+              <w:rPr>
+                <w:rFonts w:ascii="Times New Roman" w:hAnsi="Times New Roman" w:eastAsia="Times New Roman"/>
+                <w:sz w:val="24"/>
+              </w:rPr>
+              <w:t>seo</w:t>
+            </w:r>
+          </w:p>
+        </w:tc>
+        <w:tc>
+          <w:tcPr>
+            <w:tcW w:type="dxa" w:w="4896"/>
+          </w:tcPr>
+          <w:p>
+            <w:pPr>
+              <w:spacing w:line="240" w:lineRule="auto"/>
+            </w:pPr>
+            <w:r>
+              <w:rPr>
+                <w:rFonts w:ascii="Times New Roman" w:hAnsi="Times New Roman" w:eastAsia="Times New Roman"/>
+                <w:sz w:val="24"/>
+              </w:rPr>
+              <w:t>516</w:t>
+            </w:r>
+          </w:p>
+        </w:tc>
+      </w:tr>
+      <w:tr>
+        <w:trPr>
+          <w:cantSplit/>
+        </w:trPr>
+        <w:tc>
+          <w:tcPr>
+            <w:tcW w:type="dxa" w:w="4896"/>
+          </w:tcPr>
+          <w:p>
+            <w:pPr>
+              <w:spacing w:line="240" w:lineRule="auto"/>
+            </w:pPr>
+            <w:r>
+              <w:rPr>
+                <w:rFonts w:ascii="Times New Roman" w:hAnsi="Times New Roman" w:eastAsia="Times New Roman"/>
+                <w:sz w:val="24"/>
+              </w:rPr>
+              <w:t>outsourcing</w:t>
+            </w:r>
+          </w:p>
+        </w:tc>
+        <w:tc>
+          <w:tcPr>
+            <w:tcW w:type="dxa" w:w="4896"/>
+          </w:tcPr>
+          <w:p>
+            <w:pPr>
+              <w:spacing w:line="240" w:lineRule="auto"/>
+            </w:pPr>
+            <w:r>
+              <w:rPr>
+                <w:rFonts w:ascii="Times New Roman" w:hAnsi="Times New Roman" w:eastAsia="Times New Roman"/>
+                <w:sz w:val="24"/>
+              </w:rPr>
+              <w:t>445</w:t>
+            </w:r>
+          </w:p>
+        </w:tc>
+      </w:tr>
+      <w:tr>
+        <w:trPr>
+          <w:cantSplit/>
+        </w:trPr>
+        <w:tc>
+          <w:tcPr>
+            <w:tcW w:type="dxa" w:w="4896"/>
+          </w:tcPr>
+          <w:p>
+            <w:pPr>
+              <w:spacing w:line="240" w:lineRule="auto"/>
+            </w:pPr>
+            <w:r>
+              <w:rPr>
+                <w:rFonts w:ascii="Times New Roman" w:hAnsi="Times New Roman" w:eastAsia="Times New Roman"/>
+                <w:sz w:val="24"/>
+              </w:rPr>
+              <w:t>sales</w:t>
+            </w:r>
+          </w:p>
+        </w:tc>
+        <w:tc>
+          <w:tcPr>
+            <w:tcW w:type="dxa" w:w="4896"/>
+          </w:tcPr>
+          <w:p>
+            <w:pPr>
+              <w:spacing w:line="240" w:lineRule="auto"/>
+            </w:pPr>
+            <w:r>
+              <w:rPr>
+                <w:rFonts w:ascii="Times New Roman" w:hAnsi="Times New Roman" w:eastAsia="Times New Roman"/>
+                <w:sz w:val="24"/>
+              </w:rPr>
+              <w:t>432</w:t>
+            </w:r>
+          </w:p>
+        </w:tc>
+      </w:tr>
+      <w:tr>
+        <w:trPr>
+          <w:cantSplit/>
+        </w:trPr>
+        <w:tc>
+          <w:tcPr>
+            <w:tcW w:type="dxa" w:w="4896"/>
+          </w:tcPr>
+          <w:p>
+            <w:pPr>
+              <w:spacing w:line="240" w:lineRule="auto"/>
+            </w:pPr>
+            <w:r>
+              <w:rPr>
+                <w:rFonts w:ascii="Times New Roman" w:hAnsi="Times New Roman" w:eastAsia="Times New Roman"/>
+                <w:sz w:val="24"/>
+              </w:rPr>
+              <w:t>excel</w:t>
+            </w:r>
+          </w:p>
+        </w:tc>
+        <w:tc>
+          <w:tcPr>
+            <w:tcW w:type="dxa" w:w="4896"/>
+          </w:tcPr>
+          <w:p>
+            <w:pPr>
+              <w:spacing w:line="240" w:lineRule="auto"/>
+            </w:pPr>
+            <w:r>
+              <w:rPr>
+                <w:rFonts w:ascii="Times New Roman" w:hAnsi="Times New Roman" w:eastAsia="Times New Roman"/>
+                <w:sz w:val="24"/>
+              </w:rPr>
+              <w:t>429</w:t>
+            </w:r>
+          </w:p>
+        </w:tc>
+      </w:tr>
+      <w:tr>
+        <w:trPr>
+          <w:cantSplit/>
+        </w:trPr>
+        <w:tc>
+          <w:tcPr>
+            <w:tcW w:type="dxa" w:w="4896"/>
+          </w:tcPr>
+          <w:p>
+            <w:pPr>
+              <w:spacing w:line="240" w:lineRule="auto"/>
+            </w:pPr>
+            <w:r>
+              <w:rPr>
+                <w:rFonts w:ascii="Times New Roman" w:hAnsi="Times New Roman" w:eastAsia="Times New Roman"/>
+                <w:sz w:val="24"/>
+              </w:rPr>
+              <w:t>accounting</w:t>
+            </w:r>
+          </w:p>
+        </w:tc>
+        <w:tc>
+          <w:tcPr>
+            <w:tcW w:type="dxa" w:w="4896"/>
+          </w:tcPr>
+          <w:p>
+            <w:pPr>
+              <w:spacing w:line="240" w:lineRule="auto"/>
+            </w:pPr>
+            <w:r>
+              <w:rPr>
+                <w:rFonts w:ascii="Times New Roman" w:hAnsi="Times New Roman" w:eastAsia="Times New Roman"/>
+                <w:sz w:val="24"/>
+              </w:rPr>
+              <w:t>398</w:t>
+            </w:r>
+          </w:p>
+        </w:tc>
+      </w:tr>
+      <w:tr>
+        <w:trPr>
+          <w:cantSplit/>
+        </w:trPr>
+        <w:tc>
+          <w:tcPr>
+            <w:tcW w:type="dxa" w:w="4896"/>
+          </w:tcPr>
+          <w:p>
+            <w:pPr>
+              <w:spacing w:line="240" w:lineRule="auto"/>
+            </w:pPr>
+            <w:r>
+              <w:rPr>
+                <w:rFonts w:ascii="Times New Roman" w:hAnsi="Times New Roman" w:eastAsia="Times New Roman"/>
+                <w:sz w:val="24"/>
+              </w:rPr>
+              <w:t>marketing</w:t>
+            </w:r>
+          </w:p>
+        </w:tc>
+        <w:tc>
+          <w:tcPr>
+            <w:tcW w:type="dxa" w:w="4896"/>
+          </w:tcPr>
+          <w:p>
+            <w:pPr>
+              <w:spacing w:line="240" w:lineRule="auto"/>
+            </w:pPr>
+            <w:r>
+              <w:rPr>
+                <w:rFonts w:ascii="Times New Roman" w:hAnsi="Times New Roman" w:eastAsia="Times New Roman"/>
+                <w:sz w:val="24"/>
+              </w:rPr>
+              <w:t>363</w:t>
+            </w:r>
+          </w:p>
+        </w:tc>
+      </w:tr>
+    </w:tbl>
+    <w:p>
+      <w:r>
+        <w:t>Mention frequencies are not unique people or unique jobs. The job files use different aggregation structures and have no row-level join key.</w:t>
+      </w:r>
+    </w:p>
+    <w:p>
+      <w:r>
+        <w:t>Source role labels for analytics_jobs: Business Analyst (108); Data Scientist (64); Data Analyst (50); Digital Marketing Manager (45); Home Base Job/ Data Entry/online Work/part Time Work/freelancer work (45); Product Manager (44); Digital Marketing Executive (36); Analyst (35).</w:t>
+      </w:r>
+    </w:p>
+    <w:p>
+      <w:r>
+        <w:t>Reported role counts for analytics_jobs: Business Analyst (108); Data Scientist (64); Data Analyst (50); Home Base Job/ Data Entry/online Work/part Time Work/freelancer work (45); Digital Marketing Manager (45); Product Manager (44); Digital Marketing Executive (36); Analyst (35).</w:t>
+      </w:r>
+    </w:p>
+    <w:p>
+      <w:r>
+        <w:t>Source role labels for datascience_jobs: Data Scientist (188); Business Analyst (188); Data Engineer (188); Data Analyst (187); Senior Business Analyst (187); Senior Data Analyst (187); Senior Data Scientist (185); Senior Data Engineer (183).</w:t>
+      </w:r>
+    </w:p>
+    <w:p>
+      <w:r>
+        <w:t>Reported role counts for datascience_jobs: Business Analyst (32,843); Data Analyst (18,095); Senior Business Analyst (14,115); Data Scientist (9,051); Data Engineer (8,044); Senior Data Analyst (3,825); Senior Data Engineer (3,411); Senior Data Scientist (2,129).</w:t>
+      </w:r>
+    </w:p>
+    <w:p>
       <w:r>
         <w:t>analytics_jobs salary: source scale as labeled in each record; period is not inferred. Parsed values=0; median=None; observed source categories=10to15 (3,608), 15to25 (3,281), 6to10 (2,876), 0to3 (2,592), 3to6 (2,239), 25to50 (1,245).</w:t>
       </w:r>
@@ -1575,6 +2443,324 @@
     <w:p>
       <w:r>
         <w:t>The job files do not share a row-level join key, and their fields and aggregation differ. The combined view is a side-by-side summary, not a merged record set. Skill co-occurrence results are available in the generated JSON where the source text supports them.</w:t>
+      </w:r>
+    </w:p>
+    <w:p>
+      <w:r>
+        <w:br w:type="page"/>
+      </w:r>
+    </w:p>
+    <w:p>
+      <w:r>
+        <w:drawing>
+          <wp:inline xmlns:a="http://schemas.openxmlformats.org/drawingml/2006/main" xmlns:pic="http://schemas.openxmlformats.org/drawingml/2006/picture">
+            <wp:extent cx="5577840" cy="3346704"/>
+            <wp:docPr id="1" name="Picture 1" descr="Top normalized skill mentions"/>
+            <wp:cNvGraphicFramePr>
+              <a:graphicFrameLocks noChangeAspect="1"/>
+            </wp:cNvGraphicFramePr>
+            <a:graphic>
+              <a:graphicData uri="http://schemas.openxmlformats.org/drawingml/2006/picture">
+                <pic:pic>
+                  <pic:nvPicPr>
+                    <pic:cNvPr id="0" name="top_skills.png"/>
+                    <pic:cNvPicPr/>
+                  </pic:nvPicPr>
+                  <pic:blipFill>
+                    <a:blip r:embed="rId11"/>
+                    <a:stretch>
+                      <a:fillRect/>
+                    </a:stretch>
+                  </pic:blipFill>
+                  <pic:spPr>
+                    <a:xfrm>
+                      <a:off x="0" y="0"/>
+                      <a:ext cx="5577840" cy="3346704"/>
+                    </a:xfrm>
+                    <a:prstGeom prst="rect"/>
+                  </pic:spPr>
+                </pic:pic>
+              </a:graphicData>
+            </a:graphic>
+          </wp:inline>
+        </w:drawing>
+      </w:r>
+    </w:p>
+    <w:p>
+      <w:pPr>
+        <w:jc w:val="center"/>
+      </w:pPr>
+      <w:r>
+        <w:rPr>
+          <w:i/>
+          <w:sz w:val="20"/>
+        </w:rPr>
+        <w:t>Top normalized skill mentions</w:t>
+      </w:r>
+    </w:p>
+    <w:p>
+      <w:r>
+        <w:br w:type="page"/>
+      </w:r>
+    </w:p>
+    <w:p>
+      <w:r>
+        <w:drawing>
+          <wp:inline xmlns:a="http://schemas.openxmlformats.org/drawingml/2006/main" xmlns:pic="http://schemas.openxmlformats.org/drawingml/2006/picture">
+            <wp:extent cx="5577840" cy="3346704"/>
+            <wp:docPr id="2" name="Picture 2" descr="Most frequent listed role labels"/>
+            <wp:cNvGraphicFramePr>
+              <a:graphicFrameLocks noChangeAspect="1"/>
+            </wp:cNvGraphicFramePr>
+            <a:graphic>
+              <a:graphicData uri="http://schemas.openxmlformats.org/drawingml/2006/picture">
+                <pic:pic>
+                  <pic:nvPicPr>
+                    <pic:cNvPr id="0" name="top_roles.png"/>
+                    <pic:cNvPicPr/>
+                  </pic:nvPicPr>
+                  <pic:blipFill>
+                    <a:blip r:embed="rId12"/>
+                    <a:stretch>
+                      <a:fillRect/>
+                    </a:stretch>
+                  </pic:blipFill>
+                  <pic:spPr>
+                    <a:xfrm>
+                      <a:off x="0" y="0"/>
+                      <a:ext cx="5577840" cy="3346704"/>
+                    </a:xfrm>
+                    <a:prstGeom prst="rect"/>
+                  </pic:spPr>
+                </pic:pic>
+              </a:graphicData>
+            </a:graphic>
+          </wp:inline>
+        </w:drawing>
+      </w:r>
+    </w:p>
+    <w:p>
+      <w:pPr>
+        <w:jc w:val="center"/>
+      </w:pPr>
+      <w:r>
+        <w:rPr>
+          <w:i/>
+          <w:sz w:val="20"/>
+        </w:rPr>
+        <w:t>Most frequent listed role labels</w:t>
+      </w:r>
+    </w:p>
+    <w:p>
+      <w:r>
+        <w:br w:type="page"/>
+      </w:r>
+    </w:p>
+    <w:p>
+      <w:r>
+        <w:drawing>
+          <wp:inline xmlns:a="http://schemas.openxmlformats.org/drawingml/2006/main" xmlns:pic="http://schemas.openxmlformats.org/drawingml/2006/picture">
+            <wp:extent cx="5577840" cy="3346704"/>
+            <wp:docPr id="3" name="Picture 3" descr="Most frequent normalized locations"/>
+            <wp:cNvGraphicFramePr>
+              <a:graphicFrameLocks noChangeAspect="1"/>
+            </wp:cNvGraphicFramePr>
+            <a:graphic>
+              <a:graphicData uri="http://schemas.openxmlformats.org/drawingml/2006/picture">
+                <pic:pic>
+                  <pic:nvPicPr>
+                    <pic:cNvPr id="0" name="top_locations.png"/>
+                    <pic:cNvPicPr/>
+                  </pic:nvPicPr>
+                  <pic:blipFill>
+                    <a:blip r:embed="rId13"/>
+                    <a:stretch>
+                      <a:fillRect/>
+                    </a:stretch>
+                  </pic:blipFill>
+                  <pic:spPr>
+                    <a:xfrm>
+                      <a:off x="0" y="0"/>
+                      <a:ext cx="5577840" cy="3346704"/>
+                    </a:xfrm>
+                    <a:prstGeom prst="rect"/>
+                  </pic:spPr>
+                </pic:pic>
+              </a:graphicData>
+            </a:graphic>
+          </wp:inline>
+        </w:drawing>
+      </w:r>
+    </w:p>
+    <w:p>
+      <w:pPr>
+        <w:jc w:val="center"/>
+      </w:pPr>
+      <w:r>
+        <w:rPr>
+          <w:i/>
+          <w:sz w:val="20"/>
+        </w:rPr>
+        <w:t>Most frequent normalized locations</w:t>
+      </w:r>
+    </w:p>
+    <w:p>
+      <w:r>
+        <w:br w:type="page"/>
+      </w:r>
+    </w:p>
+    <w:p>
+      <w:r>
+        <w:drawing>
+          <wp:inline xmlns:a="http://schemas.openxmlformats.org/drawingml/2006/main" xmlns:pic="http://schemas.openxmlformats.org/drawingml/2006/picture">
+            <wp:extent cx="5577840" cy="3346704"/>
+            <wp:docPr id="4" name="Picture 4" descr="Observed experience requirements"/>
+            <wp:cNvGraphicFramePr>
+              <a:graphicFrameLocks noChangeAspect="1"/>
+            </wp:cNvGraphicFramePr>
+            <a:graphic>
+              <a:graphicData uri="http://schemas.openxmlformats.org/drawingml/2006/picture">
+                <pic:pic>
+                  <pic:nvPicPr>
+                    <pic:cNvPr id="0" name="experience_distribution.png"/>
+                    <pic:cNvPicPr/>
+                  </pic:nvPicPr>
+                  <pic:blipFill>
+                    <a:blip r:embed="rId14"/>
+                    <a:stretch>
+                      <a:fillRect/>
+                    </a:stretch>
+                  </pic:blipFill>
+                  <pic:spPr>
+                    <a:xfrm>
+                      <a:off x="0" y="0"/>
+                      <a:ext cx="5577840" cy="3346704"/>
+                    </a:xfrm>
+                    <a:prstGeom prst="rect"/>
+                  </pic:spPr>
+                </pic:pic>
+              </a:graphicData>
+            </a:graphic>
+          </wp:inline>
+        </w:drawing>
+      </w:r>
+    </w:p>
+    <w:p>
+      <w:pPr>
+        <w:jc w:val="center"/>
+      </w:pPr>
+      <w:r>
+        <w:rPr>
+          <w:i/>
+          <w:sz w:val="20"/>
+        </w:rPr>
+        <w:t>Observed experience requirements</w:t>
+      </w:r>
+    </w:p>
+    <w:p>
+      <w:r>
+        <w:br w:type="page"/>
+      </w:r>
+    </w:p>
+    <w:p>
+      <w:r>
+        <w:drawing>
+          <wp:inline xmlns:a="http://schemas.openxmlformats.org/drawingml/2006/main" xmlns:pic="http://schemas.openxmlformats.org/drawingml/2006/picture">
+            <wp:extent cx="5577840" cy="3346704"/>
+            <wp:docPr id="5" name="Picture 5" descr="Analytics Jobs source salary categories"/>
+            <wp:cNvGraphicFramePr>
+              <a:graphicFrameLocks noChangeAspect="1"/>
+            </wp:cNvGraphicFramePr>
+            <a:graphic>
+              <a:graphicData uri="http://schemas.openxmlformats.org/drawingml/2006/picture">
+                <pic:pic>
+                  <pic:nvPicPr>
+                    <pic:cNvPr id="0" name="analytics_jobs_salary_bands.png"/>
+                    <pic:cNvPicPr/>
+                  </pic:nvPicPr>
+                  <pic:blipFill>
+                    <a:blip r:embed="rId15"/>
+                    <a:stretch>
+                      <a:fillRect/>
+                    </a:stretch>
+                  </pic:blipFill>
+                  <pic:spPr>
+                    <a:xfrm>
+                      <a:off x="0" y="0"/>
+                      <a:ext cx="5577840" cy="3346704"/>
+                    </a:xfrm>
+                    <a:prstGeom prst="rect"/>
+                  </pic:spPr>
+                </pic:pic>
+              </a:graphicData>
+            </a:graphic>
+          </wp:inline>
+        </w:drawing>
+      </w:r>
+    </w:p>
+    <w:p>
+      <w:pPr>
+        <w:jc w:val="center"/>
+      </w:pPr>
+      <w:r>
+        <w:rPr>
+          <w:i/>
+          <w:sz w:val="20"/>
+        </w:rPr>
+        <w:t>Analytics Jobs source salary categories</w:t>
+      </w:r>
+    </w:p>
+    <w:p>
+      <w:r>
+        <w:br w:type="page"/>
+      </w:r>
+    </w:p>
+    <w:p>
+      <w:r>
+        <w:drawing>
+          <wp:inline xmlns:a="http://schemas.openxmlformats.org/drawingml/2006/main" xmlns:pic="http://schemas.openxmlformats.org/drawingml/2006/picture">
+            <wp:extent cx="5577840" cy="3346704"/>
+            <wp:docPr id="6" name="Picture 6" descr="DataScience Jobs source salary values"/>
+            <wp:cNvGraphicFramePr>
+              <a:graphicFrameLocks noChangeAspect="1"/>
+            </wp:cNvGraphicFramePr>
+            <a:graphic>
+              <a:graphicData uri="http://schemas.openxmlformats.org/drawingml/2006/picture">
+                <pic:pic>
+                  <pic:nvPicPr>
+                    <pic:cNvPr id="0" name="datascience_jobs_salary_bands.png"/>
+                    <pic:cNvPicPr/>
+                  </pic:nvPicPr>
+                  <pic:blipFill>
+                    <a:blip r:embed="rId16"/>
+                    <a:stretch>
+                      <a:fillRect/>
+                    </a:stretch>
+                  </pic:blipFill>
+                  <pic:spPr>
+                    <a:xfrm>
+                      <a:off x="0" y="0"/>
+                      <a:ext cx="5577840" cy="3346704"/>
+                    </a:xfrm>
+                    <a:prstGeom prst="rect"/>
+                  </pic:spPr>
+                </pic:pic>
+              </a:graphicData>
+            </a:graphic>
+          </wp:inline>
+        </w:drawing>
+      </w:r>
+    </w:p>
+    <w:p>
+      <w:pPr>
+        <w:jc w:val="center"/>
+      </w:pPr>
+      <w:r>
+        <w:rPr>
+          <w:i/>
+          <w:sz w:val="20"/>
+        </w:rPr>
+        <w:t>DataScience Jobs source salary values</w:t>
       </w:r>
     </w:p>
     <w:p>
@@ -1601,6 +2787,9 @@
       </w:r>
     </w:p>
     <w:p>
+      <w:pPr>
+        <w:keepNext/>
+      </w:pPr>
       <w:r>
         <w:t>Out-of-fold validation metrics:</w:t>
       </w:r>
@@ -1646,6 +2835,9 @@
       </w:r>
     </w:p>
     <w:p>
+      <w:pPr>
+        <w:keepNext/>
+      </w:pPr>
       <w:r>
         <w:t>Model comparison (macro F1):</w:t>
       </w:r>
@@ -1675,6 +2867,9 @@
       </w:r>
     </w:p>
     <w:p>
+      <w:pPr>
+        <w:keepNext/>
+      </w:pPr>
       <w:r>
         <w:t>Limitations:</w:t>
       </w:r>
@@ -1725,6 +2920,165 @@
       </w:r>
     </w:p>
     <w:p>
+      <w:r>
+        <w:br w:type="page"/>
+      </w:r>
+    </w:p>
+    <w:p>
+      <w:r>
+        <w:drawing>
+          <wp:inline xmlns:a="http://schemas.openxmlformats.org/drawingml/2006/main" xmlns:pic="http://schemas.openxmlformats.org/drawingml/2006/picture">
+            <wp:extent cx="5577840" cy="4581797"/>
+            <wp:docPr id="7" name="Picture 7" descr="JDS out-of-fold confusion matrix"/>
+            <wp:cNvGraphicFramePr>
+              <a:graphicFrameLocks noChangeAspect="1"/>
+            </wp:cNvGraphicFramePr>
+            <a:graphic>
+              <a:graphicData uri="http://schemas.openxmlformats.org/drawingml/2006/picture">
+                <pic:pic>
+                  <pic:nvPicPr>
+                    <pic:cNvPr id="0" name="confusion_matrix.png"/>
+                    <pic:cNvPicPr/>
+                  </pic:nvPicPr>
+                  <pic:blipFill>
+                    <a:blip r:embed="rId17"/>
+                    <a:stretch>
+                      <a:fillRect/>
+                    </a:stretch>
+                  </pic:blipFill>
+                  <pic:spPr>
+                    <a:xfrm>
+                      <a:off x="0" y="0"/>
+                      <a:ext cx="5577840" cy="4581797"/>
+                    </a:xfrm>
+                    <a:prstGeom prst="rect"/>
+                  </pic:spPr>
+                </pic:pic>
+              </a:graphicData>
+            </a:graphic>
+          </wp:inline>
+        </w:drawing>
+      </w:r>
+    </w:p>
+    <w:p>
+      <w:pPr>
+        <w:jc w:val="center"/>
+      </w:pPr>
+      <w:r>
+        <w:rPr>
+          <w:i/>
+          <w:sz w:val="20"/>
+        </w:rPr>
+        <w:t>JDS out-of-fold confusion matrix</w:t>
+      </w:r>
+    </w:p>
+    <w:p>
+      <w:r>
+        <w:br w:type="page"/>
+      </w:r>
+    </w:p>
+    <w:p>
+      <w:r>
+        <w:drawing>
+          <wp:inline xmlns:a="http://schemas.openxmlformats.org/drawingml/2006/main" xmlns:pic="http://schemas.openxmlformats.org/drawingml/2006/picture">
+            <wp:extent cx="5577840" cy="3824805"/>
+            <wp:docPr id="8" name="Picture 8" descr="JDS feature interpretation"/>
+            <wp:cNvGraphicFramePr>
+              <a:graphicFrameLocks noChangeAspect="1"/>
+            </wp:cNvGraphicFramePr>
+            <a:graphic>
+              <a:graphicData uri="http://schemas.openxmlformats.org/drawingml/2006/picture">
+                <pic:pic>
+                  <pic:nvPicPr>
+                    <pic:cNvPr id="0" name="feature_importance.png"/>
+                    <pic:cNvPicPr/>
+                  </pic:nvPicPr>
+                  <pic:blipFill>
+                    <a:blip r:embed="rId18"/>
+                    <a:stretch>
+                      <a:fillRect/>
+                    </a:stretch>
+                  </pic:blipFill>
+                  <pic:spPr>
+                    <a:xfrm>
+                      <a:off x="0" y="0"/>
+                      <a:ext cx="5577840" cy="3824805"/>
+                    </a:xfrm>
+                    <a:prstGeom prst="rect"/>
+                  </pic:spPr>
+                </pic:pic>
+              </a:graphicData>
+            </a:graphic>
+          </wp:inline>
+        </w:drawing>
+      </w:r>
+    </w:p>
+    <w:p>
+      <w:pPr>
+        <w:jc w:val="center"/>
+      </w:pPr>
+      <w:r>
+        <w:rPr>
+          <w:i/>
+          <w:sz w:val="20"/>
+        </w:rPr>
+        <w:t>JDS feature interpretation</w:t>
+      </w:r>
+    </w:p>
+    <w:p>
+      <w:r>
+        <w:br w:type="page"/>
+      </w:r>
+    </w:p>
+    <w:p>
+      <w:r>
+        <w:drawing>
+          <wp:inline xmlns:a="http://schemas.openxmlformats.org/drawingml/2006/main" xmlns:pic="http://schemas.openxmlformats.org/drawingml/2006/picture">
+            <wp:extent cx="5577840" cy="3585754"/>
+            <wp:docPr id="9" name="Picture 9" descr="JDS candidate model comparison"/>
+            <wp:cNvGraphicFramePr>
+              <a:graphicFrameLocks noChangeAspect="1"/>
+            </wp:cNvGraphicFramePr>
+            <a:graphic>
+              <a:graphicData uri="http://schemas.openxmlformats.org/drawingml/2006/picture">
+                <pic:pic>
+                  <pic:nvPicPr>
+                    <pic:cNvPr id="0" name="model_comparison.png"/>
+                    <pic:cNvPicPr/>
+                  </pic:nvPicPr>
+                  <pic:blipFill>
+                    <a:blip r:embed="rId19"/>
+                    <a:stretch>
+                      <a:fillRect/>
+                    </a:stretch>
+                  </pic:blipFill>
+                  <pic:spPr>
+                    <a:xfrm>
+                      <a:off x="0" y="0"/>
+                      <a:ext cx="5577840" cy="3585754"/>
+                    </a:xfrm>
+                    <a:prstGeom prst="rect"/>
+                  </pic:spPr>
+                </pic:pic>
+              </a:graphicData>
+            </a:graphic>
+          </wp:inline>
+        </w:drawing>
+      </w:r>
+    </w:p>
+    <w:p>
+      <w:pPr>
+        <w:jc w:val="center"/>
+      </w:pPr>
+      <w:r>
+        <w:rPr>
+          <w:i/>
+          <w:sz w:val="20"/>
+        </w:rPr>
+        <w:t>JDS candidate model comparison</w:t>
+      </w:r>
+    </w:p>
+    <w:p>
       <w:pPr>
         <w:pStyle w:val="Heading2"/>
       </w:pPr>
@@ -1748,6 +3102,9 @@
       </w:r>
     </w:p>
     <w:p>
+      <w:pPr>
+        <w:keepNext/>
+      </w:pPr>
       <w:r>
         <w:t>Out-of-fold validation metrics:</w:t>
       </w:r>
@@ -1793,6 +3150,9 @@
       </w:r>
     </w:p>
     <w:p>
+      <w:pPr>
+        <w:keepNext/>
+      </w:pPr>
       <w:r>
         <w:t>Model comparison (macro F1):</w:t>
       </w:r>
@@ -1822,6 +3182,9 @@
       </w:r>
     </w:p>
     <w:p>
+      <w:pPr>
+        <w:keepNext/>
+      </w:pPr>
       <w:r>
         <w:t>Limitations:</w:t>
       </w:r>
@@ -1877,6 +3240,165 @@
     <w:p>
       <w:r>
         <w:t>The random forest's feature-importance values are impurity-based within this fitted model. They describe model reliance in this sample, not causal effects, universal trait validity, or person-level suitability.</w:t>
+      </w:r>
+    </w:p>
+    <w:p>
+      <w:r>
+        <w:br w:type="page"/>
+      </w:r>
+    </w:p>
+    <w:p>
+      <w:r>
+        <w:drawing>
+          <wp:inline xmlns:a="http://schemas.openxmlformats.org/drawingml/2006/main" xmlns:pic="http://schemas.openxmlformats.org/drawingml/2006/picture">
+            <wp:extent cx="5577840" cy="4581797"/>
+            <wp:docPr id="10" name="Picture 10" descr="SDS out-of-fold confusion matrix"/>
+            <wp:cNvGraphicFramePr>
+              <a:graphicFrameLocks noChangeAspect="1"/>
+            </wp:cNvGraphicFramePr>
+            <a:graphic>
+              <a:graphicData uri="http://schemas.openxmlformats.org/drawingml/2006/picture">
+                <pic:pic>
+                  <pic:nvPicPr>
+                    <pic:cNvPr id="0" name="confusion_matrix.png"/>
+                    <pic:cNvPicPr/>
+                  </pic:nvPicPr>
+                  <pic:blipFill>
+                    <a:blip r:embed="rId20"/>
+                    <a:stretch>
+                      <a:fillRect/>
+                    </a:stretch>
+                  </pic:blipFill>
+                  <pic:spPr>
+                    <a:xfrm>
+                      <a:off x="0" y="0"/>
+                      <a:ext cx="5577840" cy="4581797"/>
+                    </a:xfrm>
+                    <a:prstGeom prst="rect"/>
+                  </pic:spPr>
+                </pic:pic>
+              </a:graphicData>
+            </a:graphic>
+          </wp:inline>
+        </w:drawing>
+      </w:r>
+    </w:p>
+    <w:p>
+      <w:pPr>
+        <w:jc w:val="center"/>
+      </w:pPr>
+      <w:r>
+        <w:rPr>
+          <w:i/>
+          <w:sz w:val="20"/>
+        </w:rPr>
+        <w:t>SDS out-of-fold confusion matrix</w:t>
+      </w:r>
+    </w:p>
+    <w:p>
+      <w:r>
+        <w:br w:type="page"/>
+      </w:r>
+    </w:p>
+    <w:p>
+      <w:r>
+        <w:drawing>
+          <wp:inline xmlns:a="http://schemas.openxmlformats.org/drawingml/2006/main" xmlns:pic="http://schemas.openxmlformats.org/drawingml/2006/picture">
+            <wp:extent cx="5577840" cy="3824805"/>
+            <wp:docPr id="11" name="Picture 11" descr="SDS feature interpretation"/>
+            <wp:cNvGraphicFramePr>
+              <a:graphicFrameLocks noChangeAspect="1"/>
+            </wp:cNvGraphicFramePr>
+            <a:graphic>
+              <a:graphicData uri="http://schemas.openxmlformats.org/drawingml/2006/picture">
+                <pic:pic>
+                  <pic:nvPicPr>
+                    <pic:cNvPr id="0" name="feature_importance.png"/>
+                    <pic:cNvPicPr/>
+                  </pic:nvPicPr>
+                  <pic:blipFill>
+                    <a:blip r:embed="rId21"/>
+                    <a:stretch>
+                      <a:fillRect/>
+                    </a:stretch>
+                  </pic:blipFill>
+                  <pic:spPr>
+                    <a:xfrm>
+                      <a:off x="0" y="0"/>
+                      <a:ext cx="5577840" cy="3824805"/>
+                    </a:xfrm>
+                    <a:prstGeom prst="rect"/>
+                  </pic:spPr>
+                </pic:pic>
+              </a:graphicData>
+            </a:graphic>
+          </wp:inline>
+        </w:drawing>
+      </w:r>
+    </w:p>
+    <w:p>
+      <w:pPr>
+        <w:jc w:val="center"/>
+      </w:pPr>
+      <w:r>
+        <w:rPr>
+          <w:i/>
+          <w:sz w:val="20"/>
+        </w:rPr>
+        <w:t>SDS feature interpretation</w:t>
+      </w:r>
+    </w:p>
+    <w:p>
+      <w:r>
+        <w:br w:type="page"/>
+      </w:r>
+    </w:p>
+    <w:p>
+      <w:r>
+        <w:drawing>
+          <wp:inline xmlns:a="http://schemas.openxmlformats.org/drawingml/2006/main" xmlns:pic="http://schemas.openxmlformats.org/drawingml/2006/picture">
+            <wp:extent cx="5577840" cy="3585754"/>
+            <wp:docPr id="12" name="Picture 12" descr="SDS candidate model comparison"/>
+            <wp:cNvGraphicFramePr>
+              <a:graphicFrameLocks noChangeAspect="1"/>
+            </wp:cNvGraphicFramePr>
+            <a:graphic>
+              <a:graphicData uri="http://schemas.openxmlformats.org/drawingml/2006/picture">
+                <pic:pic>
+                  <pic:nvPicPr>
+                    <pic:cNvPr id="0" name="model_comparison.png"/>
+                    <pic:cNvPicPr/>
+                  </pic:nvPicPr>
+                  <pic:blipFill>
+                    <a:blip r:embed="rId22"/>
+                    <a:stretch>
+                      <a:fillRect/>
+                    </a:stretch>
+                  </pic:blipFill>
+                  <pic:spPr>
+                    <a:xfrm>
+                      <a:off x="0" y="0"/>
+                      <a:ext cx="5577840" cy="3585754"/>
+                    </a:xfrm>
+                    <a:prstGeom prst="rect"/>
+                  </pic:spPr>
+                </pic:pic>
+              </a:graphicData>
+            </a:graphic>
+          </wp:inline>
+        </w:drawing>
+      </w:r>
+    </w:p>
+    <w:p>
+      <w:pPr>
+        <w:jc w:val="center"/>
+      </w:pPr>
+      <w:r>
+        <w:rPr>
+          <w:i/>
+          <w:sz w:val="20"/>
+        </w:rPr>
+        <w:t>SDS candidate model comparison</w:t>
       </w:r>
     </w:p>
     <w:p>
@@ -2161,6 +3683,73 @@
       </w:r>
     </w:p>
     <w:p>
+      <w:pPr>
+        <w:pStyle w:val="Heading2"/>
+      </w:pPr>
+      <w:r>
+        <w:t>Descriptive Talent Intelligence Workflow</w:t>
+      </w:r>
+    </w:p>
+    <w:p>
+      <w:r>
+        <w:t>The dashboard provides a separate descriptive profile workflow for six user-entered categories: Python, SQL, Machine Learning, Statistics, Big Data, and Dashboard/Storytelling. Each category is matched against normalized terms in the aggregate skill_vocabulary; its frequency is the sum of available mention counts for supported aliases. Skill mention evidence comes from the Analytics Jobs key_skills field; DataScience Jobs has no extracted skill field. The overlap percentage is the number of selected profile categories with at least one supported vocabulary term divided by the number selected. It describes vocabulary coverage only; it is not a model output, candidate fit score, employment probability, or person ranking.</w:t>
+      </w:r>
+    </w:p>
+    <w:p>
+      <w:r>
+        <w:t>The workflow lists high-frequency skill terms among the ten most-mentioned terms that were not represented by the selected profile. It also surfaces up to five role labels using explicit analyst-authored role-to-skill rules. Role frequencies come from the supplied role aggregates. The sources cannot show that a skill occurs within a particular role because the job files have different aggregation structures and no row-level join key. The UI discloses this beside the results, and the endpoint does not read or expose raw rows.</w:t>
+      </w:r>
+    </w:p>
+    <w:p>
+      <w:pPr>
+        <w:pStyle w:val="Heading2"/>
+      </w:pPr>
+      <w:r>
+        <w:t>Interpretation of model comparisons</w:t>
+      </w:r>
+    </w:p>
+    <w:p>
+      <w:r>
+        <w:t>The majority-class baseline is included to show performance available from predicting only the most common class. Macro precision, recall, and F1 weight the two encoded classes equally, which is relevant because class counts are similar but not identical. ROC-AUC is calculated from out-of-fold probabilities for the non-baseline estimators. The reported confusion matrices summarize out-of-fold hard predictions. None of these metrics establishes performance on future data, other institutions, or a new population.</w:t>
+      </w:r>
+    </w:p>
+    <w:p>
+      <w:r>
+        <w:t>The SDS metrics in particular should be read cautiously: its unusually strong separation on 161 supplied rows could be sample-specific or related to how the source label and traits were constructed. The available files do not support a finding about independent job performance. Replication with a documented target and independent, representative data is necessary before broader claims.</w:t>
+      </w:r>
+    </w:p>
+    <w:p>
+      <w:pPr>
+        <w:pStyle w:val="Heading2"/>
+      </w:pPr>
+      <w:r>
+        <w:t>Artifact and API boundaries</w:t>
+      </w:r>
+    </w:p>
+    <w:p>
+      <w:r>
+        <w:t>The pipeline creates aggregate JSON, model metadata, locally serialized model artifacts, and figures. The API validates metadata against its integration contract and never provides source rows. /api/talent/profile consumes the aggregate skill vocabulary and role summary only; /api/models/{jds|sds}/predict serves the locally trained model artifacts. Prediction forms label values as demo-entered and validate them against observed training ranges. The source code 0/1 mapping remains unchanged end to end.</w:t>
+      </w:r>
+    </w:p>
+    <w:p>
+      <w:r>
+        <w:t>Raw organizer datasets and row-level processed files remain local and are ignored by Git. The prototype has no runtime external AI API or remote frontend dependency. For a demo, bind the server to localhost and use only aggregate views.</w:t>
+      </w:r>
+    </w:p>
+    <w:p>
+      <w:pPr>
+        <w:pStyle w:val="Heading2"/>
+      </w:pPr>
+      <w:r>
+        <w:t>Generated artifact references</w:t>
+      </w:r>
+    </w:p>
+    <w:p>
+      <w:r>
+        <w:t>Data audit: data/reports/data_quality_report.md and .json. Job-market analysis: data/reports/job_market_report.md and model/artifacts/job_market_summary.json. Model runs: model/reports/jds_training.json, model/reports/sds_training.json, and metadata in model/artifacts/. Evaluation and market charts: model/figures/. API contract: API_CONTRACT.md. Demo: docs/DEMO_SCRIPT.md. Presentation: docs/PRESENTATION_OUTLINE.md.</w:t>
+      </w:r>
+    </w:p>
+    <w:p>
       <w:r>
         <w:br w:type="page"/>
       </w:r>
@@ -2175,15 +3764,10 @@
     </w:p>
     <w:p>
       <w:r>
-        <w:br w:type="page"/>
-      </w:r>
-    </w:p>
-    <w:p>
-      <w:r>
         <w:drawing>
           <wp:inline xmlns:a="http://schemas.openxmlformats.org/drawingml/2006/main" xmlns:pic="http://schemas.openxmlformats.org/drawingml/2006/picture">
             <wp:extent cx="5577840" cy="4183380"/>
-            <wp:docPr id="1" name="Picture 1" descr="class balance"/>
+            <wp:docPr id="13" name="Picture 13" descr="class balance"/>
             <wp:cNvGraphicFramePr>
               <a:graphicFrameLocks noChangeAspect="1"/>
             </wp:cNvGraphicFramePr>
@@ -2195,7 +3779,7 @@
                     <pic:cNvPicPr/>
                   </pic:nvPicPr>
                   <pic:blipFill>
-                    <a:blip r:embed="rId11"/>
+                    <a:blip r:embed="rId23"/>
                     <a:stretch>
                       <a:fillRect/>
                     </a:stretch>
@@ -2235,61 +3819,8 @@
       <w:r>
         <w:drawing>
           <wp:inline xmlns:a="http://schemas.openxmlformats.org/drawingml/2006/main" xmlns:pic="http://schemas.openxmlformats.org/drawingml/2006/picture">
-            <wp:extent cx="5577840" cy="4581797"/>
-            <wp:docPr id="2" name="Picture 2" descr="confusion matrix"/>
-            <wp:cNvGraphicFramePr>
-              <a:graphicFrameLocks noChangeAspect="1"/>
-            </wp:cNvGraphicFramePr>
-            <a:graphic>
-              <a:graphicData uri="http://schemas.openxmlformats.org/drawingml/2006/picture">
-                <pic:pic>
-                  <pic:nvPicPr>
-                    <pic:cNvPr id="0" name="confusion_matrix.png"/>
-                    <pic:cNvPicPr/>
-                  </pic:nvPicPr>
-                  <pic:blipFill>
-                    <a:blip r:embed="rId12"/>
-                    <a:stretch>
-                      <a:fillRect/>
-                    </a:stretch>
-                  </pic:blipFill>
-                  <pic:spPr>
-                    <a:xfrm>
-                      <a:off x="0" y="0"/>
-                      <a:ext cx="5577840" cy="4581797"/>
-                    </a:xfrm>
-                    <a:prstGeom prst="rect"/>
-                  </pic:spPr>
-                </pic:pic>
-              </a:graphicData>
-            </a:graphic>
-          </wp:inline>
-        </w:drawing>
-      </w:r>
-    </w:p>
-    <w:p>
-      <w:pPr>
-        <w:jc w:val="center"/>
-      </w:pPr>
-      <w:r>
-        <w:rPr>
-          <w:i/>
-          <w:sz w:val="20"/>
-        </w:rPr>
-        <w:t>Figure: confusion matrix</w:t>
-      </w:r>
-    </w:p>
-    <w:p>
-      <w:r>
-        <w:br w:type="page"/>
-      </w:r>
-    </w:p>
-    <w:p>
-      <w:r>
-        <w:drawing>
-          <wp:inline xmlns:a="http://schemas.openxmlformats.org/drawingml/2006/main" xmlns:pic="http://schemas.openxmlformats.org/drawingml/2006/picture">
             <wp:extent cx="5577840" cy="4706302"/>
-            <wp:docPr id="3" name="Picture 3" descr="correlations"/>
+            <wp:docPr id="14" name="Picture 14" descr="correlations"/>
             <wp:cNvGraphicFramePr>
               <a:graphicFrameLocks noChangeAspect="1"/>
             </wp:cNvGraphicFramePr>
@@ -2301,7 +3832,7 @@
                     <pic:cNvPicPr/>
                   </pic:nvPicPr>
                   <pic:blipFill>
-                    <a:blip r:embed="rId13"/>
+                    <a:blip r:embed="rId24"/>
                     <a:stretch>
                       <a:fillRect/>
                     </a:stretch>
@@ -2341,114 +3872,8 @@
       <w:r>
         <w:drawing>
           <wp:inline xmlns:a="http://schemas.openxmlformats.org/drawingml/2006/main" xmlns:pic="http://schemas.openxmlformats.org/drawingml/2006/picture">
-            <wp:extent cx="5577840" cy="3824805"/>
-            <wp:docPr id="4" name="Picture 4" descr="feature importance"/>
-            <wp:cNvGraphicFramePr>
-              <a:graphicFrameLocks noChangeAspect="1"/>
-            </wp:cNvGraphicFramePr>
-            <a:graphic>
-              <a:graphicData uri="http://schemas.openxmlformats.org/drawingml/2006/picture">
-                <pic:pic>
-                  <pic:nvPicPr>
-                    <pic:cNvPr id="0" name="feature_importance.png"/>
-                    <pic:cNvPicPr/>
-                  </pic:nvPicPr>
-                  <pic:blipFill>
-                    <a:blip r:embed="rId14"/>
-                    <a:stretch>
-                      <a:fillRect/>
-                    </a:stretch>
-                  </pic:blipFill>
-                  <pic:spPr>
-                    <a:xfrm>
-                      <a:off x="0" y="0"/>
-                      <a:ext cx="5577840" cy="3824805"/>
-                    </a:xfrm>
-                    <a:prstGeom prst="rect"/>
-                  </pic:spPr>
-                </pic:pic>
-              </a:graphicData>
-            </a:graphic>
-          </wp:inline>
-        </w:drawing>
-      </w:r>
-    </w:p>
-    <w:p>
-      <w:pPr>
-        <w:jc w:val="center"/>
-      </w:pPr>
-      <w:r>
-        <w:rPr>
-          <w:i/>
-          <w:sz w:val="20"/>
-        </w:rPr>
-        <w:t>Figure: feature importance</w:t>
-      </w:r>
-    </w:p>
-    <w:p>
-      <w:r>
-        <w:br w:type="page"/>
-      </w:r>
-    </w:p>
-    <w:p>
-      <w:r>
-        <w:drawing>
-          <wp:inline xmlns:a="http://schemas.openxmlformats.org/drawingml/2006/main" xmlns:pic="http://schemas.openxmlformats.org/drawingml/2006/picture">
-            <wp:extent cx="5577840" cy="3585754"/>
-            <wp:docPr id="5" name="Picture 5" descr="model comparison"/>
-            <wp:cNvGraphicFramePr>
-              <a:graphicFrameLocks noChangeAspect="1"/>
-            </wp:cNvGraphicFramePr>
-            <a:graphic>
-              <a:graphicData uri="http://schemas.openxmlformats.org/drawingml/2006/picture">
-                <pic:pic>
-                  <pic:nvPicPr>
-                    <pic:cNvPr id="0" name="model_comparison.png"/>
-                    <pic:cNvPicPr/>
-                  </pic:nvPicPr>
-                  <pic:blipFill>
-                    <a:blip r:embed="rId15"/>
-                    <a:stretch>
-                      <a:fillRect/>
-                    </a:stretch>
-                  </pic:blipFill>
-                  <pic:spPr>
-                    <a:xfrm>
-                      <a:off x="0" y="0"/>
-                      <a:ext cx="5577840" cy="3585754"/>
-                    </a:xfrm>
-                    <a:prstGeom prst="rect"/>
-                  </pic:spPr>
-                </pic:pic>
-              </a:graphicData>
-            </a:graphic>
-          </wp:inline>
-        </w:drawing>
-      </w:r>
-    </w:p>
-    <w:p>
-      <w:pPr>
-        <w:jc w:val="center"/>
-      </w:pPr>
-      <w:r>
-        <w:rPr>
-          <w:i/>
-          <w:sz w:val="20"/>
-        </w:rPr>
-        <w:t>Figure: model comparison</w:t>
-      </w:r>
-    </w:p>
-    <w:p>
-      <w:r>
-        <w:br w:type="page"/>
-      </w:r>
-    </w:p>
-    <w:p>
-      <w:r>
-        <w:drawing>
-          <wp:inline xmlns:a="http://schemas.openxmlformats.org/drawingml/2006/main" xmlns:pic="http://schemas.openxmlformats.org/drawingml/2006/picture">
             <wp:extent cx="5577840" cy="3346704"/>
-            <wp:docPr id="6" name="Picture 6" descr="analytics jobs roles"/>
+            <wp:docPr id="15" name="Picture 15" descr="analytics jobs roles"/>
             <wp:cNvGraphicFramePr>
               <a:graphicFrameLocks noChangeAspect="1"/>
             </wp:cNvGraphicFramePr>
@@ -2460,7 +3885,7 @@
                     <pic:cNvPicPr/>
                   </pic:nvPicPr>
                   <pic:blipFill>
-                    <a:blip r:embed="rId16"/>
+                    <a:blip r:embed="rId25"/>
                     <a:stretch>
                       <a:fillRect/>
                     </a:stretch>
@@ -2501,60 +3926,7 @@
         <w:drawing>
           <wp:inline xmlns:a="http://schemas.openxmlformats.org/drawingml/2006/main" xmlns:pic="http://schemas.openxmlformats.org/drawingml/2006/picture">
             <wp:extent cx="5577840" cy="3346704"/>
-            <wp:docPr id="7" name="Picture 7" descr="analytics jobs salary bands"/>
-            <wp:cNvGraphicFramePr>
-              <a:graphicFrameLocks noChangeAspect="1"/>
-            </wp:cNvGraphicFramePr>
-            <a:graphic>
-              <a:graphicData uri="http://schemas.openxmlformats.org/drawingml/2006/picture">
-                <pic:pic>
-                  <pic:nvPicPr>
-                    <pic:cNvPr id="0" name="analytics_jobs_salary_bands.png"/>
-                    <pic:cNvPicPr/>
-                  </pic:nvPicPr>
-                  <pic:blipFill>
-                    <a:blip r:embed="rId17"/>
-                    <a:stretch>
-                      <a:fillRect/>
-                    </a:stretch>
-                  </pic:blipFill>
-                  <pic:spPr>
-                    <a:xfrm>
-                      <a:off x="0" y="0"/>
-                      <a:ext cx="5577840" cy="3346704"/>
-                    </a:xfrm>
-                    <a:prstGeom prst="rect"/>
-                  </pic:spPr>
-                </pic:pic>
-              </a:graphicData>
-            </a:graphic>
-          </wp:inline>
-        </w:drawing>
-      </w:r>
-    </w:p>
-    <w:p>
-      <w:pPr>
-        <w:jc w:val="center"/>
-      </w:pPr>
-      <w:r>
-        <w:rPr>
-          <w:i/>
-          <w:sz w:val="20"/>
-        </w:rPr>
-        <w:t>Figure: analytics jobs salary bands</w:t>
-      </w:r>
-    </w:p>
-    <w:p>
-      <w:r>
-        <w:br w:type="page"/>
-      </w:r>
-    </w:p>
-    <w:p>
-      <w:r>
-        <w:drawing>
-          <wp:inline xmlns:a="http://schemas.openxmlformats.org/drawingml/2006/main" xmlns:pic="http://schemas.openxmlformats.org/drawingml/2006/picture">
-            <wp:extent cx="5577840" cy="3346704"/>
-            <wp:docPr id="8" name="Picture 8" descr="analytics jobs skills"/>
+            <wp:docPr id="16" name="Picture 16" descr="analytics jobs skills"/>
             <wp:cNvGraphicFramePr>
               <a:graphicFrameLocks noChangeAspect="1"/>
             </wp:cNvGraphicFramePr>
@@ -2566,7 +3938,7 @@
                     <pic:cNvPicPr/>
                   </pic:nvPicPr>
                   <pic:blipFill>
-                    <a:blip r:embed="rId18"/>
+                    <a:blip r:embed="rId26"/>
                     <a:stretch>
                       <a:fillRect/>
                     </a:stretch>
@@ -2607,7 +3979,7 @@
         <w:drawing>
           <wp:inline xmlns:a="http://schemas.openxmlformats.org/drawingml/2006/main" xmlns:pic="http://schemas.openxmlformats.org/drawingml/2006/picture">
             <wp:extent cx="5577840" cy="3346704"/>
-            <wp:docPr id="9" name="Picture 9" descr="datascience jobs roles"/>
+            <wp:docPr id="17" name="Picture 17" descr="datascience jobs roles"/>
             <wp:cNvGraphicFramePr>
               <a:graphicFrameLocks noChangeAspect="1"/>
             </wp:cNvGraphicFramePr>
@@ -2619,7 +3991,7 @@
                     <pic:cNvPicPr/>
                   </pic:nvPicPr>
                   <pic:blipFill>
-                    <a:blip r:embed="rId19"/>
+                    <a:blip r:embed="rId27"/>
                     <a:stretch>
                       <a:fillRect/>
                     </a:stretch>
@@ -2659,273 +4031,8 @@
       <w:r>
         <w:drawing>
           <wp:inline xmlns:a="http://schemas.openxmlformats.org/drawingml/2006/main" xmlns:pic="http://schemas.openxmlformats.org/drawingml/2006/picture">
-            <wp:extent cx="5577840" cy="3346704"/>
-            <wp:docPr id="10" name="Picture 10" descr="datascience jobs salary bands"/>
-            <wp:cNvGraphicFramePr>
-              <a:graphicFrameLocks noChangeAspect="1"/>
-            </wp:cNvGraphicFramePr>
-            <a:graphic>
-              <a:graphicData uri="http://schemas.openxmlformats.org/drawingml/2006/picture">
-                <pic:pic>
-                  <pic:nvPicPr>
-                    <pic:cNvPr id="0" name="datascience_jobs_salary_bands.png"/>
-                    <pic:cNvPicPr/>
-                  </pic:nvPicPr>
-                  <pic:blipFill>
-                    <a:blip r:embed="rId20"/>
-                    <a:stretch>
-                      <a:fillRect/>
-                    </a:stretch>
-                  </pic:blipFill>
-                  <pic:spPr>
-                    <a:xfrm>
-                      <a:off x="0" y="0"/>
-                      <a:ext cx="5577840" cy="3346704"/>
-                    </a:xfrm>
-                    <a:prstGeom prst="rect"/>
-                  </pic:spPr>
-                </pic:pic>
-              </a:graphicData>
-            </a:graphic>
-          </wp:inline>
-        </w:drawing>
-      </w:r>
-    </w:p>
-    <w:p>
-      <w:pPr>
-        <w:jc w:val="center"/>
-      </w:pPr>
-      <w:r>
-        <w:rPr>
-          <w:i/>
-          <w:sz w:val="20"/>
-        </w:rPr>
-        <w:t>Figure: datascience jobs salary bands</w:t>
-      </w:r>
-    </w:p>
-    <w:p>
-      <w:r>
-        <w:br w:type="page"/>
-      </w:r>
-    </w:p>
-    <w:p>
-      <w:r>
-        <w:drawing>
-          <wp:inline xmlns:a="http://schemas.openxmlformats.org/drawingml/2006/main" xmlns:pic="http://schemas.openxmlformats.org/drawingml/2006/picture">
-            <wp:extent cx="5577840" cy="3346704"/>
-            <wp:docPr id="11" name="Picture 11" descr="experience distribution"/>
-            <wp:cNvGraphicFramePr>
-              <a:graphicFrameLocks noChangeAspect="1"/>
-            </wp:cNvGraphicFramePr>
-            <a:graphic>
-              <a:graphicData uri="http://schemas.openxmlformats.org/drawingml/2006/picture">
-                <pic:pic>
-                  <pic:nvPicPr>
-                    <pic:cNvPr id="0" name="experience_distribution.png"/>
-                    <pic:cNvPicPr/>
-                  </pic:nvPicPr>
-                  <pic:blipFill>
-                    <a:blip r:embed="rId21"/>
-                    <a:stretch>
-                      <a:fillRect/>
-                    </a:stretch>
-                  </pic:blipFill>
-                  <pic:spPr>
-                    <a:xfrm>
-                      <a:off x="0" y="0"/>
-                      <a:ext cx="5577840" cy="3346704"/>
-                    </a:xfrm>
-                    <a:prstGeom prst="rect"/>
-                  </pic:spPr>
-                </pic:pic>
-              </a:graphicData>
-            </a:graphic>
-          </wp:inline>
-        </w:drawing>
-      </w:r>
-    </w:p>
-    <w:p>
-      <w:pPr>
-        <w:jc w:val="center"/>
-      </w:pPr>
-      <w:r>
-        <w:rPr>
-          <w:i/>
-          <w:sz w:val="20"/>
-        </w:rPr>
-        <w:t>Figure: experience distribution</w:t>
-      </w:r>
-    </w:p>
-    <w:p>
-      <w:r>
-        <w:br w:type="page"/>
-      </w:r>
-    </w:p>
-    <w:p>
-      <w:r>
-        <w:drawing>
-          <wp:inline xmlns:a="http://schemas.openxmlformats.org/drawingml/2006/main" xmlns:pic="http://schemas.openxmlformats.org/drawingml/2006/picture">
-            <wp:extent cx="5577840" cy="3346704"/>
-            <wp:docPr id="12" name="Picture 12" descr="top locations"/>
-            <wp:cNvGraphicFramePr>
-              <a:graphicFrameLocks noChangeAspect="1"/>
-            </wp:cNvGraphicFramePr>
-            <a:graphic>
-              <a:graphicData uri="http://schemas.openxmlformats.org/drawingml/2006/picture">
-                <pic:pic>
-                  <pic:nvPicPr>
-                    <pic:cNvPr id="0" name="top_locations.png"/>
-                    <pic:cNvPicPr/>
-                  </pic:nvPicPr>
-                  <pic:blipFill>
-                    <a:blip r:embed="rId22"/>
-                    <a:stretch>
-                      <a:fillRect/>
-                    </a:stretch>
-                  </pic:blipFill>
-                  <pic:spPr>
-                    <a:xfrm>
-                      <a:off x="0" y="0"/>
-                      <a:ext cx="5577840" cy="3346704"/>
-                    </a:xfrm>
-                    <a:prstGeom prst="rect"/>
-                  </pic:spPr>
-                </pic:pic>
-              </a:graphicData>
-            </a:graphic>
-          </wp:inline>
-        </w:drawing>
-      </w:r>
-    </w:p>
-    <w:p>
-      <w:pPr>
-        <w:jc w:val="center"/>
-      </w:pPr>
-      <w:r>
-        <w:rPr>
-          <w:i/>
-          <w:sz w:val="20"/>
-        </w:rPr>
-        <w:t>Figure: top locations</w:t>
-      </w:r>
-    </w:p>
-    <w:p>
-      <w:r>
-        <w:br w:type="page"/>
-      </w:r>
-    </w:p>
-    <w:p>
-      <w:r>
-        <w:drawing>
-          <wp:inline xmlns:a="http://schemas.openxmlformats.org/drawingml/2006/main" xmlns:pic="http://schemas.openxmlformats.org/drawingml/2006/picture">
-            <wp:extent cx="5577840" cy="3346704"/>
-            <wp:docPr id="13" name="Picture 13" descr="top roles"/>
-            <wp:cNvGraphicFramePr>
-              <a:graphicFrameLocks noChangeAspect="1"/>
-            </wp:cNvGraphicFramePr>
-            <a:graphic>
-              <a:graphicData uri="http://schemas.openxmlformats.org/drawingml/2006/picture">
-                <pic:pic>
-                  <pic:nvPicPr>
-                    <pic:cNvPr id="0" name="top_roles.png"/>
-                    <pic:cNvPicPr/>
-                  </pic:nvPicPr>
-                  <pic:blipFill>
-                    <a:blip r:embed="rId23"/>
-                    <a:stretch>
-                      <a:fillRect/>
-                    </a:stretch>
-                  </pic:blipFill>
-                  <pic:spPr>
-                    <a:xfrm>
-                      <a:off x="0" y="0"/>
-                      <a:ext cx="5577840" cy="3346704"/>
-                    </a:xfrm>
-                    <a:prstGeom prst="rect"/>
-                  </pic:spPr>
-                </pic:pic>
-              </a:graphicData>
-            </a:graphic>
-          </wp:inline>
-        </w:drawing>
-      </w:r>
-    </w:p>
-    <w:p>
-      <w:pPr>
-        <w:jc w:val="center"/>
-      </w:pPr>
-      <w:r>
-        <w:rPr>
-          <w:i/>
-          <w:sz w:val="20"/>
-        </w:rPr>
-        <w:t>Figure: top roles</w:t>
-      </w:r>
-    </w:p>
-    <w:p>
-      <w:r>
-        <w:br w:type="page"/>
-      </w:r>
-    </w:p>
-    <w:p>
-      <w:r>
-        <w:drawing>
-          <wp:inline xmlns:a="http://schemas.openxmlformats.org/drawingml/2006/main" xmlns:pic="http://schemas.openxmlformats.org/drawingml/2006/picture">
-            <wp:extent cx="5577840" cy="3346704"/>
-            <wp:docPr id="14" name="Picture 14" descr="top skills"/>
-            <wp:cNvGraphicFramePr>
-              <a:graphicFrameLocks noChangeAspect="1"/>
-            </wp:cNvGraphicFramePr>
-            <a:graphic>
-              <a:graphicData uri="http://schemas.openxmlformats.org/drawingml/2006/picture">
-                <pic:pic>
-                  <pic:nvPicPr>
-                    <pic:cNvPr id="0" name="top_skills.png"/>
-                    <pic:cNvPicPr/>
-                  </pic:nvPicPr>
-                  <pic:blipFill>
-                    <a:blip r:embed="rId24"/>
-                    <a:stretch>
-                      <a:fillRect/>
-                    </a:stretch>
-                  </pic:blipFill>
-                  <pic:spPr>
-                    <a:xfrm>
-                      <a:off x="0" y="0"/>
-                      <a:ext cx="5577840" cy="3346704"/>
-                    </a:xfrm>
-                    <a:prstGeom prst="rect"/>
-                  </pic:spPr>
-                </pic:pic>
-              </a:graphicData>
-            </a:graphic>
-          </wp:inline>
-        </w:drawing>
-      </w:r>
-    </w:p>
-    <w:p>
-      <w:pPr>
-        <w:jc w:val="center"/>
-      </w:pPr>
-      <w:r>
-        <w:rPr>
-          <w:i/>
-          <w:sz w:val="20"/>
-        </w:rPr>
-        <w:t>Figure: top skills</w:t>
-      </w:r>
-    </w:p>
-    <w:p>
-      <w:r>
-        <w:br w:type="page"/>
-      </w:r>
-    </w:p>
-    <w:p>
-      <w:r>
-        <w:drawing>
-          <wp:inline xmlns:a="http://schemas.openxmlformats.org/drawingml/2006/main" xmlns:pic="http://schemas.openxmlformats.org/drawingml/2006/picture">
             <wp:extent cx="5577840" cy="4183380"/>
-            <wp:docPr id="15" name="Picture 15" descr="class balance"/>
+            <wp:docPr id="18" name="Picture 18" descr="class balance"/>
             <wp:cNvGraphicFramePr>
               <a:graphicFrameLocks noChangeAspect="1"/>
             </wp:cNvGraphicFramePr>
@@ -2937,7 +4044,7 @@
                     <pic:cNvPicPr/>
                   </pic:nvPicPr>
                   <pic:blipFill>
-                    <a:blip r:embed="rId25"/>
+                    <a:blip r:embed="rId28"/>
                     <a:stretch>
                       <a:fillRect/>
                     </a:stretch>
@@ -2977,61 +4084,8 @@
       <w:r>
         <w:drawing>
           <wp:inline xmlns:a="http://schemas.openxmlformats.org/drawingml/2006/main" xmlns:pic="http://schemas.openxmlformats.org/drawingml/2006/picture">
-            <wp:extent cx="5577840" cy="4581797"/>
-            <wp:docPr id="16" name="Picture 16" descr="confusion matrix"/>
-            <wp:cNvGraphicFramePr>
-              <a:graphicFrameLocks noChangeAspect="1"/>
-            </wp:cNvGraphicFramePr>
-            <a:graphic>
-              <a:graphicData uri="http://schemas.openxmlformats.org/drawingml/2006/picture">
-                <pic:pic>
-                  <pic:nvPicPr>
-                    <pic:cNvPr id="0" name="confusion_matrix.png"/>
-                    <pic:cNvPicPr/>
-                  </pic:nvPicPr>
-                  <pic:blipFill>
-                    <a:blip r:embed="rId26"/>
-                    <a:stretch>
-                      <a:fillRect/>
-                    </a:stretch>
-                  </pic:blipFill>
-                  <pic:spPr>
-                    <a:xfrm>
-                      <a:off x="0" y="0"/>
-                      <a:ext cx="5577840" cy="4581797"/>
-                    </a:xfrm>
-                    <a:prstGeom prst="rect"/>
-                  </pic:spPr>
-                </pic:pic>
-              </a:graphicData>
-            </a:graphic>
-          </wp:inline>
-        </w:drawing>
-      </w:r>
-    </w:p>
-    <w:p>
-      <w:pPr>
-        <w:jc w:val="center"/>
-      </w:pPr>
-      <w:r>
-        <w:rPr>
-          <w:i/>
-          <w:sz w:val="20"/>
-        </w:rPr>
-        <w:t>Figure: confusion matrix</w:t>
-      </w:r>
-    </w:p>
-    <w:p>
-      <w:r>
-        <w:br w:type="page"/>
-      </w:r>
-    </w:p>
-    <w:p>
-      <w:r>
-        <w:drawing>
-          <wp:inline xmlns:a="http://schemas.openxmlformats.org/drawingml/2006/main" xmlns:pic="http://schemas.openxmlformats.org/drawingml/2006/picture">
             <wp:extent cx="5577840" cy="4706302"/>
-            <wp:docPr id="17" name="Picture 17" descr="correlations"/>
+            <wp:docPr id="19" name="Picture 19" descr="correlations"/>
             <wp:cNvGraphicFramePr>
               <a:graphicFrameLocks noChangeAspect="1"/>
             </wp:cNvGraphicFramePr>
@@ -3043,7 +4097,7 @@
                     <pic:cNvPicPr/>
                   </pic:nvPicPr>
                   <pic:blipFill>
-                    <a:blip r:embed="rId27"/>
+                    <a:blip r:embed="rId29"/>
                     <a:stretch>
                       <a:fillRect/>
                     </a:stretch>
@@ -3072,112 +4126,6 @@
           <w:sz w:val="20"/>
         </w:rPr>
         <w:t>Figure: correlations</w:t>
-      </w:r>
-    </w:p>
-    <w:p>
-      <w:r>
-        <w:br w:type="page"/>
-      </w:r>
-    </w:p>
-    <w:p>
-      <w:r>
-        <w:drawing>
-          <wp:inline xmlns:a="http://schemas.openxmlformats.org/drawingml/2006/main" xmlns:pic="http://schemas.openxmlformats.org/drawingml/2006/picture">
-            <wp:extent cx="5577840" cy="3824805"/>
-            <wp:docPr id="18" name="Picture 18" descr="feature importance"/>
-            <wp:cNvGraphicFramePr>
-              <a:graphicFrameLocks noChangeAspect="1"/>
-            </wp:cNvGraphicFramePr>
-            <a:graphic>
-              <a:graphicData uri="http://schemas.openxmlformats.org/drawingml/2006/picture">
-                <pic:pic>
-                  <pic:nvPicPr>
-                    <pic:cNvPr id="0" name="feature_importance.png"/>
-                    <pic:cNvPicPr/>
-                  </pic:nvPicPr>
-                  <pic:blipFill>
-                    <a:blip r:embed="rId28"/>
-                    <a:stretch>
-                      <a:fillRect/>
-                    </a:stretch>
-                  </pic:blipFill>
-                  <pic:spPr>
-                    <a:xfrm>
-                      <a:off x="0" y="0"/>
-                      <a:ext cx="5577840" cy="3824805"/>
-                    </a:xfrm>
-                    <a:prstGeom prst="rect"/>
-                  </pic:spPr>
-                </pic:pic>
-              </a:graphicData>
-            </a:graphic>
-          </wp:inline>
-        </w:drawing>
-      </w:r>
-    </w:p>
-    <w:p>
-      <w:pPr>
-        <w:jc w:val="center"/>
-      </w:pPr>
-      <w:r>
-        <w:rPr>
-          <w:i/>
-          <w:sz w:val="20"/>
-        </w:rPr>
-        <w:t>Figure: feature importance</w:t>
-      </w:r>
-    </w:p>
-    <w:p>
-      <w:r>
-        <w:br w:type="page"/>
-      </w:r>
-    </w:p>
-    <w:p>
-      <w:r>
-        <w:drawing>
-          <wp:inline xmlns:a="http://schemas.openxmlformats.org/drawingml/2006/main" xmlns:pic="http://schemas.openxmlformats.org/drawingml/2006/picture">
-            <wp:extent cx="5577840" cy="3585754"/>
-            <wp:docPr id="19" name="Picture 19" descr="model comparison"/>
-            <wp:cNvGraphicFramePr>
-              <a:graphicFrameLocks noChangeAspect="1"/>
-            </wp:cNvGraphicFramePr>
-            <a:graphic>
-              <a:graphicData uri="http://schemas.openxmlformats.org/drawingml/2006/picture">
-                <pic:pic>
-                  <pic:nvPicPr>
-                    <pic:cNvPr id="0" name="model_comparison.png"/>
-                    <pic:cNvPicPr/>
-                  </pic:nvPicPr>
-                  <pic:blipFill>
-                    <a:blip r:embed="rId29"/>
-                    <a:stretch>
-                      <a:fillRect/>
-                    </a:stretch>
-                  </pic:blipFill>
-                  <pic:spPr>
-                    <a:xfrm>
-                      <a:off x="0" y="0"/>
-                      <a:ext cx="5577840" cy="3585754"/>
-                    </a:xfrm>
-                    <a:prstGeom prst="rect"/>
-                  </pic:spPr>
-                </pic:pic>
-              </a:graphicData>
-            </a:graphic>
-          </wp:inline>
-        </w:drawing>
-      </w:r>
-    </w:p>
-    <w:p>
-      <w:pPr>
-        <w:jc w:val="center"/>
-      </w:pPr>
-      <w:r>
-        <w:rPr>
-          <w:i/>
-          <w:sz w:val="20"/>
-        </w:rPr>
-        <w:t>Figure: model comparison</w:t>
       </w:r>
     </w:p>
     <w:sectPr>

</xml_diff>